<commit_message>
Sincronizacion automatica a GitHub de la tesis en Word, presentacion, articulo IEEE y codigo fuente
</commit_message>
<xml_diff>
--- a/TESIS_LATEX/articulo_ieee.docx
+++ b/TESIS_LATEX/articulo_ieee.docx
@@ -148,7 +148,7 @@
           <w:color w:val="000000"/>
           <w:sz w:val="48"/>
         </w:rPr>
-        <w:t>Stacking</w:t>
+        <w:t>basado</w:t>
       </w:r>
       <w:r>
         <w:rPr>
@@ -158,7 +158,7 @@
           <w:color w:val="000000"/>
           <w:sz w:val="48"/>
         </w:rPr>
-        <w:t>con</w:t>
+        <w:t>en</w:t>
       </w:r>
       <w:r>
         <w:rPr>
@@ -168,7 +168,7 @@
           <w:color w:val="000000"/>
           <w:sz w:val="48"/>
         </w:rPr>
-        <w:t>Entropía</w:t>
+        <w:t>Stacking,</w:t>
       </w:r>
     </w:p>
     <w:p>
@@ -188,7 +188,7 @@
           <w:color w:val="000000"/>
           <w:sz w:val="48"/>
         </w:rPr>
-        <w:t>de</w:t>
+        <w:t>XGBoost</w:t>
       </w:r>
       <w:r>
         <w:rPr>
@@ -198,7 +198,7 @@
           <w:color w:val="000000"/>
           <w:sz w:val="48"/>
         </w:rPr>
-        <w:t>Shannon</w:t>
+        <w:t>y</w:t>
       </w:r>
       <w:r>
         <w:rPr>
@@ -208,7 +208,7 @@
           <w:color w:val="000000"/>
           <w:sz w:val="48"/>
         </w:rPr>
-        <w:t>y</w:t>
+        <w:t>LightGBM,</w:t>
       </w:r>
       <w:r>
         <w:rPr>
@@ -218,7 +218,17 @@
           <w:color w:val="000000"/>
           <w:sz w:val="48"/>
         </w:rPr>
-        <w:t>Borderline-SMOTE</w:t>
+        <w:t>Puno</w:t>
+      </w:r>
+      <w:r>
+        <w:rPr>
+          <w:rFonts w:ascii="LMRoman17" w:hAnsi="LMRoman17" w:eastAsia="LMRoman17"/>
+          <w:b w:val="0"/>
+          <w:i w:val="0"/>
+          <w:color w:val="000000"/>
+          <w:sz w:val="48"/>
+        </w:rPr>
+        <w:t>2026</w:t>
       </w:r>
     </w:p>
     <w:p>

</xml_diff>